<commit_message>
added silrec_demo.docx as an Options link item for download v2
</commit_message>
<xml_diff>
--- a/silrec/templates/docs/silrec_demo.docx
+++ b/silrec/templates/docs/silrec_demo.docx
@@ -49,49 +49,54 @@
         </w:rPr>
       </w:pPr>
       <w:r>
-        <w:rPr/>
-      </w:r>
-    </w:p>
-    <w:p>
-      <w:pPr>
-        <w:pStyle w:val="Normal"/>
-        <w:bidi w:val="0"/>
-        <w:jc w:val="center"/>
         <w:rPr>
           <w:b/>
           <w:bCs/>
           <w:sz w:val="28"/>
           <w:szCs w:val="28"/>
         </w:rPr>
-      </w:pPr>
-      <w:r>
+      </w:r>
+    </w:p>
+    <w:p>
+      <w:pPr>
+        <w:pStyle w:val="Normal"/>
+        <w:bidi w:val="0"/>
+        <w:jc w:val="center"/>
         <w:rPr>
           <w:b/>
           <w:bCs/>
           <w:sz w:val="28"/>
           <w:szCs w:val="28"/>
         </w:rPr>
-      </w:r>
-    </w:p>
-    <w:p>
-      <w:pPr>
-        <w:pStyle w:val="Normal"/>
-        <w:bidi w:val="0"/>
-        <w:jc w:val="start"/>
+      </w:pPr>
+      <w:r>
         <w:rPr>
           <w:b/>
           <w:bCs/>
           <w:sz w:val="28"/>
           <w:szCs w:val="28"/>
         </w:rPr>
-      </w:pPr>
-      <w:r>
+      </w:r>
+    </w:p>
+    <w:p>
+      <w:pPr>
+        <w:pStyle w:val="Normal"/>
+        <w:bidi w:val="0"/>
+        <w:jc w:val="start"/>
         <w:rPr>
           <w:b/>
           <w:bCs/>
           <w:sz w:val="28"/>
           <w:szCs w:val="28"/>
         </w:rPr>
+      </w:pPr>
+      <w:r>
+        <w:rPr>
+          <w:b/>
+          <w:bCs/>
+          <w:sz w:val="28"/>
+          <w:szCs w:val="28"/>
+        </w:rPr>
         <w:t>Contents</w:t>
       </w:r>
     </w:p>
@@ -136,14 +141,7 @@
           <w:b w:val="false"/>
           <w:bCs w:val="false"/>
         </w:rPr>
-        <w:t xml:space="preserve">Treatments - </w:t>
-      </w:r>
-      <w:r>
-        <w:rPr>
-          <w:b w:val="false"/>
-          <w:bCs w:val="false"/>
-        </w:rPr>
-        <w:t>Geometries/Polygons</w:t>
+        <w:t>Treatments - Geometries/Polygons</w:t>
       </w:r>
     </w:p>
     <w:p>
@@ -165,14 +163,7 @@
           <w:b w:val="false"/>
           <w:bCs w:val="false"/>
         </w:rPr>
-        <w:t xml:space="preserve">Map </w:t>
-      </w:r>
-      <w:r>
-        <w:rPr>
-          <w:b w:val="false"/>
-          <w:bCs w:val="false"/>
-        </w:rPr>
-        <w:t>View - Geometries/Polygons</w:t>
+        <w:t>Map View - Geometries/Polygons</w:t>
       </w:r>
     </w:p>
     <w:p>
@@ -238,677 +229,7 @@
           <w:b w:val="false"/>
           <w:bCs w:val="false"/>
         </w:rPr>
-        <w:t xml:space="preserve">Admin – </w:t>
-      </w:r>
-      <w:r>
-        <w:rPr>
-          <w:b w:val="false"/>
-          <w:bCs w:val="false"/>
-        </w:rPr>
-        <w:t>Configuration Settings</w:t>
-      </w:r>
-    </w:p>
-    <w:p>
-      <w:pPr>
-        <w:pStyle w:val="Normal"/>
-        <w:bidi w:val="0"/>
-        <w:jc w:val="start"/>
-        <w:rPr>
-          <w:b w:val="false"/>
-          <w:bCs w:val="false"/>
-        </w:rPr>
-      </w:pPr>
-      <w:r>
-        <w:rPr>
-          <w:b w:val="false"/>
-          <w:bCs w:val="false"/>
-        </w:rPr>
-      </w:r>
-    </w:p>
-    <w:p>
-      <w:pPr>
-        <w:pStyle w:val="Normal"/>
-        <w:bidi w:val="0"/>
-        <w:jc w:val="start"/>
-        <w:rPr>
-          <w:b w:val="false"/>
-          <w:bCs w:val="false"/>
-        </w:rPr>
-      </w:pPr>
-      <w:r>
-        <w:rPr>
-          <w:b w:val="false"/>
-          <w:bCs w:val="false"/>
-        </w:rPr>
-      </w:r>
-    </w:p>
-    <w:p>
-      <w:pPr>
-        <w:pStyle w:val="Normal"/>
-        <w:bidi w:val="0"/>
-        <w:jc w:val="start"/>
-        <w:rPr>
-          <w:b w:val="false"/>
-          <w:bCs w:val="false"/>
-        </w:rPr>
-      </w:pPr>
-      <w:r>
-        <w:rPr>
-          <w:b w:val="false"/>
-          <w:bCs w:val="false"/>
-        </w:rPr>
-      </w:r>
-    </w:p>
-    <w:p>
-      <w:pPr>
-        <w:pStyle w:val="Normal"/>
-        <w:bidi w:val="0"/>
-        <w:jc w:val="start"/>
-        <w:rPr>
-          <w:b w:val="false"/>
-          <w:bCs w:val="false"/>
-        </w:rPr>
-      </w:pPr>
-      <w:r>
-        <w:rPr>
-          <w:b w:val="false"/>
-          <w:bCs w:val="false"/>
-        </w:rPr>
-      </w:r>
-    </w:p>
-    <w:p>
-      <w:pPr>
-        <w:pStyle w:val="Normal"/>
-        <w:bidi w:val="0"/>
-        <w:jc w:val="start"/>
-        <w:rPr>
-          <w:b w:val="false"/>
-          <w:bCs w:val="false"/>
-        </w:rPr>
-      </w:pPr>
-      <w:r>
-        <w:rPr>
-          <w:b w:val="false"/>
-          <w:bCs w:val="false"/>
-        </w:rPr>
-      </w:r>
-    </w:p>
-    <w:p>
-      <w:pPr>
-        <w:pStyle w:val="Normal"/>
-        <w:bidi w:val="0"/>
-        <w:jc w:val="start"/>
-        <w:rPr>
-          <w:b w:val="false"/>
-          <w:bCs w:val="false"/>
-        </w:rPr>
-      </w:pPr>
-      <w:r>
-        <w:rPr>
-          <w:b w:val="false"/>
-          <w:bCs w:val="false"/>
-        </w:rPr>
-      </w:r>
-    </w:p>
-    <w:p>
-      <w:pPr>
-        <w:pStyle w:val="Normal"/>
-        <w:bidi w:val="0"/>
-        <w:jc w:val="start"/>
-        <w:rPr>
-          <w:b w:val="false"/>
-          <w:bCs w:val="false"/>
-        </w:rPr>
-      </w:pPr>
-      <w:r>
-        <w:rPr>
-          <w:b w:val="false"/>
-          <w:bCs w:val="false"/>
-        </w:rPr>
-      </w:r>
-    </w:p>
-    <w:p>
-      <w:pPr>
-        <w:pStyle w:val="Normal"/>
-        <w:bidi w:val="0"/>
-        <w:jc w:val="start"/>
-        <w:rPr>
-          <w:b w:val="false"/>
-          <w:bCs w:val="false"/>
-        </w:rPr>
-      </w:pPr>
-      <w:r>
-        <w:rPr>
-          <w:b w:val="false"/>
-          <w:bCs w:val="false"/>
-        </w:rPr>
-      </w:r>
-    </w:p>
-    <w:p>
-      <w:pPr>
-        <w:pStyle w:val="Normal"/>
-        <w:bidi w:val="0"/>
-        <w:jc w:val="start"/>
-        <w:rPr>
-          <w:b w:val="false"/>
-          <w:bCs w:val="false"/>
-        </w:rPr>
-      </w:pPr>
-      <w:r>
-        <w:rPr>
-          <w:b w:val="false"/>
-          <w:bCs w:val="false"/>
-        </w:rPr>
-      </w:r>
-    </w:p>
-    <w:p>
-      <w:pPr>
-        <w:pStyle w:val="Normal"/>
-        <w:bidi w:val="0"/>
-        <w:jc w:val="start"/>
-        <w:rPr>
-          <w:b w:val="false"/>
-          <w:bCs w:val="false"/>
-        </w:rPr>
-      </w:pPr>
-      <w:r>
-        <w:rPr>
-          <w:b w:val="false"/>
-          <w:bCs w:val="false"/>
-        </w:rPr>
-      </w:r>
-    </w:p>
-    <w:p>
-      <w:pPr>
-        <w:pStyle w:val="Normal"/>
-        <w:bidi w:val="0"/>
-        <w:jc w:val="start"/>
-        <w:rPr>
-          <w:b w:val="false"/>
-          <w:bCs w:val="false"/>
-        </w:rPr>
-      </w:pPr>
-      <w:r>
-        <w:rPr>
-          <w:b w:val="false"/>
-          <w:bCs w:val="false"/>
-        </w:rPr>
-      </w:r>
-    </w:p>
-    <w:p>
-      <w:pPr>
-        <w:pStyle w:val="Normal"/>
-        <w:bidi w:val="0"/>
-        <w:jc w:val="start"/>
-        <w:rPr>
-          <w:b w:val="false"/>
-          <w:bCs w:val="false"/>
-        </w:rPr>
-      </w:pPr>
-      <w:r>
-        <w:rPr>
-          <w:b w:val="false"/>
-          <w:bCs w:val="false"/>
-        </w:rPr>
-      </w:r>
-    </w:p>
-    <w:p>
-      <w:pPr>
-        <w:pStyle w:val="Normal"/>
-        <w:bidi w:val="0"/>
-        <w:jc w:val="start"/>
-        <w:rPr>
-          <w:b w:val="false"/>
-          <w:bCs w:val="false"/>
-        </w:rPr>
-      </w:pPr>
-      <w:r>
-        <w:rPr>
-          <w:b w:val="false"/>
-          <w:bCs w:val="false"/>
-        </w:rPr>
-      </w:r>
-    </w:p>
-    <w:p>
-      <w:pPr>
-        <w:pStyle w:val="Normal"/>
-        <w:bidi w:val="0"/>
-        <w:jc w:val="start"/>
-        <w:rPr>
-          <w:b w:val="false"/>
-          <w:bCs w:val="false"/>
-        </w:rPr>
-      </w:pPr>
-      <w:r>
-        <w:rPr>
-          <w:b w:val="false"/>
-          <w:bCs w:val="false"/>
-        </w:rPr>
-      </w:r>
-    </w:p>
-    <w:p>
-      <w:pPr>
-        <w:pStyle w:val="Normal"/>
-        <w:bidi w:val="0"/>
-        <w:jc w:val="start"/>
-        <w:rPr>
-          <w:b w:val="false"/>
-          <w:bCs w:val="false"/>
-        </w:rPr>
-      </w:pPr>
-      <w:r>
-        <w:rPr>
-          <w:b w:val="false"/>
-          <w:bCs w:val="false"/>
-        </w:rPr>
-      </w:r>
-    </w:p>
-    <w:p>
-      <w:pPr>
-        <w:pStyle w:val="Normal"/>
-        <w:bidi w:val="0"/>
-        <w:jc w:val="start"/>
-        <w:rPr>
-          <w:b w:val="false"/>
-          <w:bCs w:val="false"/>
-        </w:rPr>
-      </w:pPr>
-      <w:r>
-        <w:rPr>
-          <w:b w:val="false"/>
-          <w:bCs w:val="false"/>
-        </w:rPr>
-      </w:r>
-    </w:p>
-    <w:p>
-      <w:pPr>
-        <w:pStyle w:val="Normal"/>
-        <w:bidi w:val="0"/>
-        <w:jc w:val="start"/>
-        <w:rPr>
-          <w:b w:val="false"/>
-          <w:bCs w:val="false"/>
-        </w:rPr>
-      </w:pPr>
-      <w:r>
-        <w:rPr>
-          <w:b w:val="false"/>
-          <w:bCs w:val="false"/>
-        </w:rPr>
-      </w:r>
-    </w:p>
-    <w:p>
-      <w:pPr>
-        <w:pStyle w:val="Normal"/>
-        <w:bidi w:val="0"/>
-        <w:jc w:val="start"/>
-        <w:rPr>
-          <w:b w:val="false"/>
-          <w:bCs w:val="false"/>
-        </w:rPr>
-      </w:pPr>
-      <w:r>
-        <w:rPr>
-          <w:b w:val="false"/>
-          <w:bCs w:val="false"/>
-        </w:rPr>
-      </w:r>
-    </w:p>
-    <w:p>
-      <w:pPr>
-        <w:pStyle w:val="Normal"/>
-        <w:bidi w:val="0"/>
-        <w:jc w:val="start"/>
-        <w:rPr>
-          <w:b w:val="false"/>
-          <w:bCs w:val="false"/>
-        </w:rPr>
-      </w:pPr>
-      <w:r>
-        <w:rPr>
-          <w:b w:val="false"/>
-          <w:bCs w:val="false"/>
-        </w:rPr>
-      </w:r>
-    </w:p>
-    <w:p>
-      <w:pPr>
-        <w:pStyle w:val="Normal"/>
-        <w:bidi w:val="0"/>
-        <w:jc w:val="start"/>
-        <w:rPr>
-          <w:b w:val="false"/>
-          <w:bCs w:val="false"/>
-        </w:rPr>
-      </w:pPr>
-      <w:r>
-        <w:rPr>
-          <w:b w:val="false"/>
-          <w:bCs w:val="false"/>
-        </w:rPr>
-      </w:r>
-    </w:p>
-    <w:p>
-      <w:pPr>
-        <w:pStyle w:val="Normal"/>
-        <w:bidi w:val="0"/>
-        <w:jc w:val="start"/>
-        <w:rPr>
-          <w:b w:val="false"/>
-          <w:bCs w:val="false"/>
-        </w:rPr>
-      </w:pPr>
-      <w:r>
-        <w:rPr>
-          <w:b w:val="false"/>
-          <w:bCs w:val="false"/>
-        </w:rPr>
-      </w:r>
-    </w:p>
-    <w:p>
-      <w:pPr>
-        <w:pStyle w:val="Normal"/>
-        <w:bidi w:val="0"/>
-        <w:jc w:val="start"/>
-        <w:rPr>
-          <w:b w:val="false"/>
-          <w:bCs w:val="false"/>
-        </w:rPr>
-      </w:pPr>
-      <w:r>
-        <w:rPr>
-          <w:b w:val="false"/>
-          <w:bCs w:val="false"/>
-        </w:rPr>
-      </w:r>
-    </w:p>
-    <w:p>
-      <w:pPr>
-        <w:pStyle w:val="Normal"/>
-        <w:bidi w:val="0"/>
-        <w:jc w:val="start"/>
-        <w:rPr>
-          <w:b w:val="false"/>
-          <w:bCs w:val="false"/>
-        </w:rPr>
-      </w:pPr>
-      <w:r>
-        <w:rPr>
-          <w:b w:val="false"/>
-          <w:bCs w:val="false"/>
-        </w:rPr>
-      </w:r>
-    </w:p>
-    <w:p>
-      <w:pPr>
-        <w:pStyle w:val="Normal"/>
-        <w:bidi w:val="0"/>
-        <w:jc w:val="start"/>
-        <w:rPr>
-          <w:b w:val="false"/>
-          <w:bCs w:val="false"/>
-        </w:rPr>
-      </w:pPr>
-      <w:r>
-        <w:rPr>
-          <w:b w:val="false"/>
-          <w:bCs w:val="false"/>
-        </w:rPr>
-      </w:r>
-    </w:p>
-    <w:p>
-      <w:pPr>
-        <w:pStyle w:val="Normal"/>
-        <w:bidi w:val="0"/>
-        <w:jc w:val="start"/>
-        <w:rPr>
-          <w:b w:val="false"/>
-          <w:bCs w:val="false"/>
-        </w:rPr>
-      </w:pPr>
-      <w:r>
-        <w:rPr>
-          <w:b w:val="false"/>
-          <w:bCs w:val="false"/>
-        </w:rPr>
-      </w:r>
-    </w:p>
-    <w:p>
-      <w:pPr>
-        <w:pStyle w:val="Normal"/>
-        <w:bidi w:val="0"/>
-        <w:jc w:val="start"/>
-        <w:rPr>
-          <w:b w:val="false"/>
-          <w:bCs w:val="false"/>
-        </w:rPr>
-      </w:pPr>
-      <w:r>
-        <w:rPr>
-          <w:b w:val="false"/>
-          <w:bCs w:val="false"/>
-        </w:rPr>
-      </w:r>
-    </w:p>
-    <w:p>
-      <w:pPr>
-        <w:pStyle w:val="Normal"/>
-        <w:bidi w:val="0"/>
-        <w:jc w:val="start"/>
-        <w:rPr>
-          <w:b w:val="false"/>
-          <w:bCs w:val="false"/>
-        </w:rPr>
-      </w:pPr>
-      <w:r>
-        <w:rPr>
-          <w:b w:val="false"/>
-          <w:bCs w:val="false"/>
-        </w:rPr>
-      </w:r>
-    </w:p>
-    <w:p>
-      <w:pPr>
-        <w:pStyle w:val="Normal"/>
-        <w:bidi w:val="0"/>
-        <w:jc w:val="start"/>
-        <w:rPr>
-          <w:b w:val="false"/>
-          <w:bCs w:val="false"/>
-        </w:rPr>
-      </w:pPr>
-      <w:r>
-        <w:rPr>
-          <w:b w:val="false"/>
-          <w:bCs w:val="false"/>
-        </w:rPr>
-      </w:r>
-    </w:p>
-    <w:p>
-      <w:pPr>
-        <w:pStyle w:val="Normal"/>
-        <w:bidi w:val="0"/>
-        <w:jc w:val="start"/>
-        <w:rPr>
-          <w:b w:val="false"/>
-          <w:bCs w:val="false"/>
-        </w:rPr>
-      </w:pPr>
-      <w:r>
-        <w:rPr>
-          <w:b w:val="false"/>
-          <w:bCs w:val="false"/>
-        </w:rPr>
-      </w:r>
-    </w:p>
-    <w:p>
-      <w:pPr>
-        <w:pStyle w:val="Normal"/>
-        <w:bidi w:val="0"/>
-        <w:jc w:val="start"/>
-        <w:rPr>
-          <w:b w:val="false"/>
-          <w:bCs w:val="false"/>
-        </w:rPr>
-      </w:pPr>
-      <w:r>
-        <w:rPr>
-          <w:b w:val="false"/>
-          <w:bCs w:val="false"/>
-        </w:rPr>
-      </w:r>
-    </w:p>
-    <w:p>
-      <w:pPr>
-        <w:pStyle w:val="Normal"/>
-        <w:bidi w:val="0"/>
-        <w:jc w:val="start"/>
-        <w:rPr>
-          <w:b w:val="false"/>
-          <w:bCs w:val="false"/>
-        </w:rPr>
-      </w:pPr>
-      <w:r>
-        <w:rPr>
-          <w:b w:val="false"/>
-          <w:bCs w:val="false"/>
-        </w:rPr>
-      </w:r>
-    </w:p>
-    <w:p>
-      <w:pPr>
-        <w:pStyle w:val="Normal"/>
-        <w:bidi w:val="0"/>
-        <w:jc w:val="start"/>
-        <w:rPr>
-          <w:b w:val="false"/>
-          <w:bCs w:val="false"/>
-        </w:rPr>
-      </w:pPr>
-      <w:r>
-        <w:rPr>
-          <w:b w:val="false"/>
-          <w:bCs w:val="false"/>
-        </w:rPr>
-      </w:r>
-    </w:p>
-    <w:p>
-      <w:pPr>
-        <w:pStyle w:val="Normal"/>
-        <w:bidi w:val="0"/>
-        <w:jc w:val="start"/>
-        <w:rPr>
-          <w:b w:val="false"/>
-          <w:bCs w:val="false"/>
-        </w:rPr>
-      </w:pPr>
-      <w:r>
-        <w:rPr>
-          <w:b w:val="false"/>
-          <w:bCs w:val="false"/>
-        </w:rPr>
-      </w:r>
-    </w:p>
-    <w:p>
-      <w:pPr>
-        <w:pStyle w:val="Normal"/>
-        <w:bidi w:val="0"/>
-        <w:jc w:val="start"/>
-        <w:rPr>
-          <w:b w:val="false"/>
-          <w:bCs w:val="false"/>
-        </w:rPr>
-      </w:pPr>
-      <w:r>
-        <w:rPr>
-          <w:b w:val="false"/>
-          <w:bCs w:val="false"/>
-        </w:rPr>
-      </w:r>
-    </w:p>
-    <w:p>
-      <w:pPr>
-        <w:pStyle w:val="Normal"/>
-        <w:bidi w:val="0"/>
-        <w:jc w:val="start"/>
-        <w:rPr>
-          <w:b w:val="false"/>
-          <w:bCs w:val="false"/>
-        </w:rPr>
-      </w:pPr>
-      <w:r>
-        <w:rPr>
-          <w:b w:val="false"/>
-          <w:bCs w:val="false"/>
-        </w:rPr>
-      </w:r>
-    </w:p>
-    <w:p>
-      <w:pPr>
-        <w:pStyle w:val="Normal"/>
-        <w:bidi w:val="0"/>
-        <w:jc w:val="start"/>
-        <w:rPr>
-          <w:b w:val="false"/>
-          <w:bCs w:val="false"/>
-        </w:rPr>
-      </w:pPr>
-      <w:r>
-        <w:rPr>
-          <w:b w:val="false"/>
-          <w:bCs w:val="false"/>
-        </w:rPr>
-      </w:r>
-    </w:p>
-    <w:p>
-      <w:pPr>
-        <w:pStyle w:val="Normal"/>
-        <w:bidi w:val="0"/>
-        <w:jc w:val="start"/>
-        <w:rPr>
-          <w:b w:val="false"/>
-          <w:bCs w:val="false"/>
-        </w:rPr>
-      </w:pPr>
-      <w:r>
-        <w:rPr>
-          <w:b w:val="false"/>
-          <w:bCs w:val="false"/>
-        </w:rPr>
-      </w:r>
-    </w:p>
-    <w:p>
-      <w:pPr>
-        <w:pStyle w:val="Normal"/>
-        <w:bidi w:val="0"/>
-        <w:jc w:val="start"/>
-        <w:rPr>
-          <w:b w:val="false"/>
-          <w:bCs w:val="false"/>
-        </w:rPr>
-      </w:pPr>
-      <w:r>
-        <w:rPr>
-          <w:b w:val="false"/>
-          <w:bCs w:val="false"/>
-        </w:rPr>
-      </w:r>
-    </w:p>
-    <w:p>
-      <w:pPr>
-        <w:pStyle w:val="Normal"/>
-        <w:bidi w:val="0"/>
-        <w:jc w:val="start"/>
-        <w:rPr>
-          <w:b w:val="false"/>
-          <w:bCs w:val="false"/>
-        </w:rPr>
-      </w:pPr>
-      <w:r>
-        <w:rPr>
-          <w:b w:val="false"/>
-          <w:bCs w:val="false"/>
-        </w:rPr>
+        <w:t>Admin – Configuration Settings</w:t>
       </w:r>
     </w:p>
     <w:p>
@@ -940,6 +261,9 @@
       </w:pPr>
       <w:r>
         <w:rPr/>
+      </w:r>
+      <w:r>
+        <w:br w:type="page"/>
       </w:r>
     </w:p>
     <w:p>
@@ -1788,49 +1112,8 @@
       <w:r>
         <w:rPr/>
       </w:r>
-    </w:p>
-    <w:p>
-      <w:pPr>
-        <w:pStyle w:val="Normal"/>
-        <w:bidi w:val="0"/>
-        <w:jc w:val="start"/>
-        <w:rPr/>
-      </w:pPr>
-      <w:r>
-        <w:rPr/>
-      </w:r>
-    </w:p>
-    <w:p>
-      <w:pPr>
-        <w:pStyle w:val="Normal"/>
-        <w:bidi w:val="0"/>
-        <w:jc w:val="start"/>
-        <w:rPr/>
-      </w:pPr>
-      <w:r>
-        <w:rPr/>
-      </w:r>
-    </w:p>
-    <w:p>
-      <w:pPr>
-        <w:pStyle w:val="Normal"/>
-        <w:bidi w:val="0"/>
-        <w:jc w:val="start"/>
-        <w:rPr/>
-      </w:pPr>
-      <w:r>
-        <w:rPr/>
-      </w:r>
-    </w:p>
-    <w:p>
-      <w:pPr>
-        <w:pStyle w:val="Normal"/>
-        <w:bidi w:val="0"/>
-        <w:jc w:val="start"/>
-        <w:rPr/>
-      </w:pPr>
-      <w:r>
-        <w:rPr/>
+      <w:r>
+        <w:br w:type="page"/>
       </w:r>
     </w:p>
     <w:p>
@@ -2460,170 +1743,8 @@
       <w:r>
         <w:rPr/>
       </w:r>
-    </w:p>
-    <w:p>
-      <w:pPr>
-        <w:pStyle w:val="Normal"/>
-        <w:bidi w:val="0"/>
-        <w:jc w:val="start"/>
-        <w:rPr/>
-      </w:pPr>
-      <w:r>
-        <w:rPr/>
-      </w:r>
-    </w:p>
-    <w:p>
-      <w:pPr>
-        <w:pStyle w:val="Normal"/>
-        <w:bidi w:val="0"/>
-        <w:jc w:val="start"/>
-        <w:rPr/>
-      </w:pPr>
-      <w:r>
-        <w:rPr/>
-      </w:r>
-    </w:p>
-    <w:p>
-      <w:pPr>
-        <w:pStyle w:val="Normal"/>
-        <w:bidi w:val="0"/>
-        <w:jc w:val="start"/>
-        <w:rPr/>
-      </w:pPr>
-      <w:r>
-        <w:rPr/>
-      </w:r>
-    </w:p>
-    <w:p>
-      <w:pPr>
-        <w:pStyle w:val="Normal"/>
-        <w:bidi w:val="0"/>
-        <w:jc w:val="start"/>
-        <w:rPr/>
-      </w:pPr>
-      <w:r>
-        <w:rPr/>
-      </w:r>
-    </w:p>
-    <w:p>
-      <w:pPr>
-        <w:pStyle w:val="Normal"/>
-        <w:bidi w:val="0"/>
-        <w:jc w:val="start"/>
-        <w:rPr/>
-      </w:pPr>
-      <w:r>
-        <w:rPr/>
-      </w:r>
-    </w:p>
-    <w:p>
-      <w:pPr>
-        <w:pStyle w:val="Normal"/>
-        <w:bidi w:val="0"/>
-        <w:jc w:val="start"/>
-        <w:rPr/>
-      </w:pPr>
-      <w:r>
-        <w:rPr/>
-      </w:r>
-    </w:p>
-    <w:p>
-      <w:pPr>
-        <w:pStyle w:val="Normal"/>
-        <w:bidi w:val="0"/>
-        <w:jc w:val="start"/>
-        <w:rPr/>
-      </w:pPr>
-      <w:r>
-        <w:rPr/>
-      </w:r>
-    </w:p>
-    <w:p>
-      <w:pPr>
-        <w:pStyle w:val="Normal"/>
-        <w:bidi w:val="0"/>
-        <w:jc w:val="start"/>
-        <w:rPr/>
-      </w:pPr>
-      <w:r>
-        <w:rPr/>
-      </w:r>
-    </w:p>
-    <w:p>
-      <w:pPr>
-        <w:pStyle w:val="Normal"/>
-        <w:bidi w:val="0"/>
-        <w:jc w:val="start"/>
-        <w:rPr/>
-      </w:pPr>
-      <w:r>
-        <w:rPr/>
-      </w:r>
-    </w:p>
-    <w:p>
-      <w:pPr>
-        <w:pStyle w:val="Normal"/>
-        <w:bidi w:val="0"/>
-        <w:jc w:val="start"/>
-        <w:rPr/>
-      </w:pPr>
-      <w:r>
-        <w:rPr/>
-      </w:r>
-    </w:p>
-    <w:p>
-      <w:pPr>
-        <w:pStyle w:val="Normal"/>
-        <w:bidi w:val="0"/>
-        <w:jc w:val="start"/>
-        <w:rPr/>
-      </w:pPr>
-      <w:r>
-        <w:rPr/>
-      </w:r>
-    </w:p>
-    <w:p>
-      <w:pPr>
-        <w:pStyle w:val="Normal"/>
-        <w:bidi w:val="0"/>
-        <w:jc w:val="start"/>
-        <w:rPr/>
-      </w:pPr>
-      <w:r>
-        <w:rPr/>
-      </w:r>
-    </w:p>
-    <w:p>
-      <w:pPr>
-        <w:pStyle w:val="Normal"/>
-        <w:bidi w:val="0"/>
-        <w:jc w:val="start"/>
-        <w:rPr/>
-      </w:pPr>
-      <w:r>
-        <w:rPr/>
-      </w:r>
-    </w:p>
-    <w:p>
-      <w:pPr>
-        <w:pStyle w:val="Normal"/>
-        <w:bidi w:val="0"/>
-        <w:jc w:val="start"/>
-        <w:rPr/>
-      </w:pPr>
-      <w:r>
-        <w:rPr/>
-      </w:r>
-    </w:p>
-    <w:p>
-      <w:pPr>
-        <w:pStyle w:val="Normal"/>
-        <w:bidi w:val="0"/>
-        <w:jc w:val="start"/>
-        <w:rPr/>
-      </w:pPr>
-      <w:r>
-        <w:rPr/>
+      <w:r>
+        <w:br w:type="page"/>
       </w:r>
     </w:p>
     <w:p>
@@ -3156,104 +2277,8 @@
       <w:r>
         <w:rPr/>
       </w:r>
-    </w:p>
-    <w:p>
-      <w:pPr>
-        <w:pStyle w:val="Normal"/>
-        <w:bidi w:val="0"/>
-        <w:jc w:val="start"/>
-        <w:rPr/>
-      </w:pPr>
-      <w:r>
-        <w:rPr/>
-      </w:r>
-    </w:p>
-    <w:p>
-      <w:pPr>
-        <w:pStyle w:val="Normal"/>
-        <w:bidi w:val="0"/>
-        <w:jc w:val="start"/>
-        <w:rPr/>
-      </w:pPr>
-      <w:r>
-        <w:rPr/>
-      </w:r>
-    </w:p>
-    <w:p>
-      <w:pPr>
-        <w:pStyle w:val="Normal"/>
-        <w:bidi w:val="0"/>
-        <w:jc w:val="start"/>
-        <w:rPr/>
-      </w:pPr>
-      <w:r>
-        <w:rPr/>
-      </w:r>
-    </w:p>
-    <w:p>
-      <w:pPr>
-        <w:pStyle w:val="Normal"/>
-        <w:bidi w:val="0"/>
-        <w:jc w:val="start"/>
-        <w:rPr/>
-      </w:pPr>
-      <w:r>
-        <w:rPr/>
-      </w:r>
-    </w:p>
-    <w:p>
-      <w:pPr>
-        <w:pStyle w:val="Normal"/>
-        <w:bidi w:val="0"/>
-        <w:jc w:val="start"/>
-        <w:rPr/>
-      </w:pPr>
-      <w:r>
-        <w:rPr/>
-      </w:r>
-    </w:p>
-    <w:p>
-      <w:pPr>
-        <w:pStyle w:val="Normal"/>
-        <w:bidi w:val="0"/>
-        <w:jc w:val="start"/>
-        <w:rPr/>
-      </w:pPr>
-      <w:r>
-        <w:rPr/>
-      </w:r>
-    </w:p>
-    <w:p>
-      <w:pPr>
-        <w:pStyle w:val="Normal"/>
-        <w:bidi w:val="0"/>
-        <w:jc w:val="start"/>
-        <w:rPr/>
-      </w:pPr>
-      <w:r>
-        <w:rPr/>
-      </w:r>
-    </w:p>
-    <w:p>
-      <w:pPr>
-        <w:pStyle w:val="Normal"/>
-        <w:bidi w:val="0"/>
-        <w:jc w:val="start"/>
-        <w:rPr/>
-      </w:pPr>
-      <w:r>
-        <w:rPr/>
-      </w:r>
-    </w:p>
-    <w:p>
-      <w:pPr>
-        <w:pStyle w:val="Normal"/>
-        <w:bidi w:val="0"/>
-        <w:jc w:val="start"/>
-        <w:rPr/>
-      </w:pPr>
-      <w:r>
-        <w:rPr/>
+      <w:r>
+        <w:br w:type="page"/>
       </w:r>
     </w:p>
     <w:p>
@@ -3556,21 +2581,10 @@
         </w:rPr>
       </w:pPr>
       <w:r>
-        <w:rPr/>
-      </w:r>
-    </w:p>
-    <w:p>
-      <w:pPr>
-        <w:pStyle w:val="Normal"/>
-        <w:bidi w:val="0"/>
-        <w:jc w:val="start"/>
         <w:rPr>
           <w:b/>
           <w:bCs/>
         </w:rPr>
-      </w:pPr>
-      <w:r>
-        <w:rPr/>
       </w:r>
     </w:p>
     <w:p>
@@ -3584,21 +2598,10 @@
         </w:rPr>
       </w:pPr>
       <w:r>
-        <w:rPr/>
-      </w:r>
-    </w:p>
-    <w:p>
-      <w:pPr>
-        <w:pStyle w:val="Normal"/>
-        <w:bidi w:val="0"/>
-        <w:jc w:val="start"/>
         <w:rPr>
           <w:b/>
           <w:bCs/>
         </w:rPr>
-      </w:pPr>
-      <w:r>
-        <w:rPr/>
       </w:r>
     </w:p>
     <w:p>
@@ -3612,21 +2615,10 @@
         </w:rPr>
       </w:pPr>
       <w:r>
-        <w:rPr/>
-      </w:r>
-    </w:p>
-    <w:p>
-      <w:pPr>
-        <w:pStyle w:val="Normal"/>
-        <w:bidi w:val="0"/>
-        <w:jc w:val="start"/>
         <w:rPr>
           <w:b/>
           <w:bCs/>
         </w:rPr>
-      </w:pPr>
-      <w:r>
-        <w:rPr/>
       </w:r>
     </w:p>
     <w:p>
@@ -3642,335 +2634,23 @@
       <w:r>
         <w:rPr/>
       </w:r>
-    </w:p>
-    <w:p>
-      <w:pPr>
-        <w:pStyle w:val="Normal"/>
-        <w:bidi w:val="0"/>
-        <w:jc w:val="start"/>
+      <w:r>
+        <w:br w:type="page"/>
+      </w:r>
+    </w:p>
+    <w:p>
+      <w:pPr>
+        <w:pStyle w:val="Normal"/>
+        <w:bidi w:val="0"/>
+        <w:jc w:val="start"/>
+        <w:rPr/>
+      </w:pPr>
+      <w:r>
         <w:rPr>
           <w:b/>
           <w:bCs/>
         </w:rPr>
-      </w:pPr>
-      <w:r>
-        <w:rPr/>
-      </w:r>
-    </w:p>
-    <w:p>
-      <w:pPr>
-        <w:pStyle w:val="Normal"/>
-        <w:bidi w:val="0"/>
-        <w:jc w:val="start"/>
-        <w:rPr>
-          <w:b/>
-          <w:bCs/>
-        </w:rPr>
-      </w:pPr>
-      <w:r>
-        <w:rPr/>
-      </w:r>
-    </w:p>
-    <w:p>
-      <w:pPr>
-        <w:pStyle w:val="Normal"/>
-        <w:bidi w:val="0"/>
-        <w:jc w:val="start"/>
-        <w:rPr>
-          <w:b/>
-          <w:bCs/>
-        </w:rPr>
-      </w:pPr>
-      <w:r>
-        <w:rPr/>
-      </w:r>
-    </w:p>
-    <w:p>
-      <w:pPr>
-        <w:pStyle w:val="Normal"/>
-        <w:bidi w:val="0"/>
-        <w:jc w:val="start"/>
-        <w:rPr>
-          <w:b/>
-          <w:bCs/>
-        </w:rPr>
-      </w:pPr>
-      <w:r>
-        <w:rPr/>
-      </w:r>
-    </w:p>
-    <w:p>
-      <w:pPr>
-        <w:pStyle w:val="Normal"/>
-        <w:bidi w:val="0"/>
-        <w:jc w:val="start"/>
-        <w:rPr>
-          <w:b/>
-          <w:bCs/>
-        </w:rPr>
-      </w:pPr>
-      <w:r>
-        <w:rPr/>
-      </w:r>
-    </w:p>
-    <w:p>
-      <w:pPr>
-        <w:pStyle w:val="Normal"/>
-        <w:bidi w:val="0"/>
-        <w:jc w:val="start"/>
-        <w:rPr>
-          <w:b/>
-          <w:bCs/>
-        </w:rPr>
-      </w:pPr>
-      <w:r>
-        <w:rPr/>
-      </w:r>
-    </w:p>
-    <w:p>
-      <w:pPr>
-        <w:pStyle w:val="Normal"/>
-        <w:bidi w:val="0"/>
-        <w:jc w:val="start"/>
-        <w:rPr>
-          <w:b/>
-          <w:bCs/>
-        </w:rPr>
-      </w:pPr>
-      <w:r>
-        <w:rPr/>
-      </w:r>
-    </w:p>
-    <w:p>
-      <w:pPr>
-        <w:pStyle w:val="Normal"/>
-        <w:bidi w:val="0"/>
-        <w:jc w:val="start"/>
-        <w:rPr>
-          <w:b/>
-          <w:bCs/>
-        </w:rPr>
-      </w:pPr>
-      <w:r>
-        <w:rPr/>
-      </w:r>
-    </w:p>
-    <w:p>
-      <w:pPr>
-        <w:pStyle w:val="Normal"/>
-        <w:bidi w:val="0"/>
-        <w:jc w:val="start"/>
-        <w:rPr>
-          <w:b/>
-          <w:bCs/>
-        </w:rPr>
-      </w:pPr>
-      <w:r>
-        <w:rPr/>
-      </w:r>
-    </w:p>
-    <w:p>
-      <w:pPr>
-        <w:pStyle w:val="Normal"/>
-        <w:bidi w:val="0"/>
-        <w:jc w:val="start"/>
-        <w:rPr>
-          <w:b/>
-          <w:bCs/>
-        </w:rPr>
-      </w:pPr>
-      <w:r>
-        <w:rPr/>
-      </w:r>
-    </w:p>
-    <w:p>
-      <w:pPr>
-        <w:pStyle w:val="Normal"/>
-        <w:bidi w:val="0"/>
-        <w:jc w:val="start"/>
-        <w:rPr>
-          <w:b/>
-          <w:bCs/>
-        </w:rPr>
-      </w:pPr>
-      <w:r>
-        <w:rPr/>
-      </w:r>
-    </w:p>
-    <w:p>
-      <w:pPr>
-        <w:pStyle w:val="Normal"/>
-        <w:bidi w:val="0"/>
-        <w:jc w:val="start"/>
-        <w:rPr>
-          <w:b/>
-          <w:bCs/>
-        </w:rPr>
-      </w:pPr>
-      <w:r>
-        <w:rPr/>
-      </w:r>
-    </w:p>
-    <w:p>
-      <w:pPr>
-        <w:pStyle w:val="Normal"/>
-        <w:bidi w:val="0"/>
-        <w:jc w:val="start"/>
-        <w:rPr>
-          <w:b/>
-          <w:bCs/>
-        </w:rPr>
-      </w:pPr>
-      <w:r>
-        <w:rPr/>
-      </w:r>
-    </w:p>
-    <w:p>
-      <w:pPr>
-        <w:pStyle w:val="Normal"/>
-        <w:bidi w:val="0"/>
-        <w:jc w:val="start"/>
-        <w:rPr>
-          <w:b/>
-          <w:bCs/>
-        </w:rPr>
-      </w:pPr>
-      <w:r>
-        <w:rPr/>
-      </w:r>
-    </w:p>
-    <w:p>
-      <w:pPr>
-        <w:pStyle w:val="Normal"/>
-        <w:bidi w:val="0"/>
-        <w:jc w:val="start"/>
-        <w:rPr>
-          <w:b/>
-          <w:bCs/>
-        </w:rPr>
-      </w:pPr>
-      <w:r>
-        <w:rPr/>
-      </w:r>
-    </w:p>
-    <w:p>
-      <w:pPr>
-        <w:pStyle w:val="Normal"/>
-        <w:bidi w:val="0"/>
-        <w:jc w:val="start"/>
-        <w:rPr>
-          <w:b/>
-          <w:bCs/>
-        </w:rPr>
-      </w:pPr>
-      <w:r>
-        <w:rPr/>
-      </w:r>
-    </w:p>
-    <w:p>
-      <w:pPr>
-        <w:pStyle w:val="Normal"/>
-        <w:bidi w:val="0"/>
-        <w:jc w:val="start"/>
-        <w:rPr>
-          <w:b/>
-          <w:bCs/>
-        </w:rPr>
-      </w:pPr>
-      <w:r>
-        <w:rPr/>
-      </w:r>
-    </w:p>
-    <w:p>
-      <w:pPr>
-        <w:pStyle w:val="Normal"/>
-        <w:bidi w:val="0"/>
-        <w:jc w:val="start"/>
-        <w:rPr>
-          <w:b/>
-          <w:bCs/>
-        </w:rPr>
-      </w:pPr>
-      <w:r>
-        <w:rPr/>
-      </w:r>
-    </w:p>
-    <w:p>
-      <w:pPr>
-        <w:pStyle w:val="Normal"/>
-        <w:bidi w:val="0"/>
-        <w:jc w:val="start"/>
-        <w:rPr>
-          <w:b/>
-          <w:bCs/>
-        </w:rPr>
-      </w:pPr>
-      <w:r>
-        <w:rPr/>
-      </w:r>
-    </w:p>
-    <w:p>
-      <w:pPr>
-        <w:pStyle w:val="Normal"/>
-        <w:bidi w:val="0"/>
-        <w:jc w:val="start"/>
-        <w:rPr>
-          <w:b/>
-          <w:bCs/>
-        </w:rPr>
-      </w:pPr>
-      <w:r>
-        <w:rPr/>
-      </w:r>
-    </w:p>
-    <w:p>
-      <w:pPr>
-        <w:pStyle w:val="Normal"/>
-        <w:bidi w:val="0"/>
-        <w:jc w:val="start"/>
-        <w:rPr>
-          <w:b/>
-          <w:bCs/>
-        </w:rPr>
-      </w:pPr>
-      <w:r>
-        <w:rPr/>
-      </w:r>
-    </w:p>
-    <w:p>
-      <w:pPr>
-        <w:pStyle w:val="Normal"/>
-        <w:bidi w:val="0"/>
-        <w:jc w:val="start"/>
-        <w:rPr>
-          <w:b/>
-          <w:bCs/>
-        </w:rPr>
-      </w:pPr>
-      <w:r>
-        <w:rPr/>
-      </w:r>
-    </w:p>
-    <w:p>
-      <w:pPr>
-        <w:pStyle w:val="Normal"/>
-        <w:bidi w:val="0"/>
-        <w:jc w:val="start"/>
-        <w:rPr/>
-      </w:pPr>
-      <w:r>
-        <w:rPr>
-          <w:b/>
-          <w:bCs/>
-        </w:rPr>
-        <w:t xml:space="preserve">2. Treatments - </w:t>
-      </w:r>
-      <w:r>
-        <w:rPr>
-          <w:b/>
-          <w:bCs/>
-        </w:rPr>
-        <w:t>Geometries/Polygons</w:t>
+        <w:t>2. Treatments - Geometries/Polygons</w:t>
       </w:r>
     </w:p>
     <w:p>
@@ -4333,233 +3013,34 @@
         <w:pStyle w:val="Normal"/>
         <w:bidi w:val="0"/>
         <w:jc w:val="start"/>
-        <w:rPr/>
-      </w:pPr>
-      <w:r>
-        <w:rPr/>
-      </w:r>
-    </w:p>
-    <w:p>
-      <w:pPr>
-        <w:pStyle w:val="Normal"/>
-        <w:bidi w:val="0"/>
-        <w:jc w:val="start"/>
-        <w:rPr/>
-      </w:pPr>
-      <w:r>
-        <w:rPr/>
-      </w:r>
-    </w:p>
-    <w:p>
-      <w:pPr>
-        <w:pStyle w:val="Normal"/>
-        <w:bidi w:val="0"/>
-        <w:jc w:val="start"/>
-        <w:rPr/>
-      </w:pPr>
-      <w:r>
-        <w:rPr/>
-      </w:r>
-    </w:p>
-    <w:p>
-      <w:pPr>
-        <w:pStyle w:val="Normal"/>
-        <w:bidi w:val="0"/>
-        <w:jc w:val="start"/>
-        <w:rPr/>
-      </w:pPr>
-      <w:r>
-        <w:rPr/>
-      </w:r>
-    </w:p>
-    <w:p>
-      <w:pPr>
-        <w:pStyle w:val="Normal"/>
-        <w:bidi w:val="0"/>
-        <w:jc w:val="start"/>
-        <w:rPr/>
-      </w:pPr>
-      <w:r>
-        <w:rPr/>
-      </w:r>
-    </w:p>
-    <w:p>
-      <w:pPr>
-        <w:pStyle w:val="Normal"/>
-        <w:bidi w:val="0"/>
-        <w:jc w:val="start"/>
-        <w:rPr/>
-      </w:pPr>
-      <w:r>
-        <w:rPr/>
-      </w:r>
-    </w:p>
-    <w:p>
-      <w:pPr>
-        <w:pStyle w:val="Normal"/>
-        <w:bidi w:val="0"/>
-        <w:jc w:val="start"/>
-        <w:rPr/>
-      </w:pPr>
-      <w:r>
-        <w:rPr/>
-      </w:r>
-    </w:p>
-    <w:p>
-      <w:pPr>
-        <w:pStyle w:val="Normal"/>
-        <w:bidi w:val="0"/>
-        <w:jc w:val="start"/>
-        <w:rPr/>
-      </w:pPr>
-      <w:r>
-        <w:rPr/>
-      </w:r>
-    </w:p>
-    <w:p>
-      <w:pPr>
-        <w:pStyle w:val="Normal"/>
-        <w:bidi w:val="0"/>
-        <w:jc w:val="start"/>
-        <w:rPr/>
-      </w:pPr>
-      <w:r>
-        <w:rPr/>
-      </w:r>
-    </w:p>
-    <w:p>
-      <w:pPr>
-        <w:pStyle w:val="Normal"/>
-        <w:bidi w:val="0"/>
-        <w:jc w:val="start"/>
-        <w:rPr/>
-      </w:pPr>
-      <w:r>
-        <w:rPr/>
-      </w:r>
-    </w:p>
-    <w:p>
-      <w:pPr>
-        <w:pStyle w:val="Normal"/>
-        <w:bidi w:val="0"/>
-        <w:jc w:val="start"/>
-        <w:rPr/>
-      </w:pPr>
-      <w:r>
-        <w:rPr/>
-      </w:r>
-    </w:p>
-    <w:p>
-      <w:pPr>
-        <w:pStyle w:val="Normal"/>
-        <w:bidi w:val="0"/>
-        <w:jc w:val="start"/>
-        <w:rPr/>
-      </w:pPr>
-      <w:r>
-        <w:rPr/>
-      </w:r>
-    </w:p>
-    <w:p>
-      <w:pPr>
-        <w:pStyle w:val="Normal"/>
-        <w:bidi w:val="0"/>
-        <w:jc w:val="start"/>
-        <w:rPr/>
-      </w:pPr>
-      <w:r>
-        <w:rPr/>
-      </w:r>
-    </w:p>
-    <w:p>
-      <w:pPr>
-        <w:pStyle w:val="Normal"/>
-        <w:bidi w:val="0"/>
-        <w:jc w:val="start"/>
-        <w:rPr/>
-      </w:pPr>
-      <w:r>
-        <w:rPr/>
-      </w:r>
-    </w:p>
-    <w:p>
-      <w:pPr>
-        <w:pStyle w:val="Normal"/>
-        <w:bidi w:val="0"/>
-        <w:jc w:val="start"/>
-        <w:rPr/>
-      </w:pPr>
-      <w:r>
-        <w:rPr/>
-      </w:r>
-    </w:p>
-    <w:p>
-      <w:pPr>
-        <w:pStyle w:val="Normal"/>
-        <w:bidi w:val="0"/>
-        <w:jc w:val="start"/>
-        <w:rPr/>
-      </w:pPr>
-      <w:r>
-        <w:rPr/>
-      </w:r>
-    </w:p>
-    <w:p>
-      <w:pPr>
-        <w:pStyle w:val="Normal"/>
-        <w:bidi w:val="0"/>
-        <w:jc w:val="start"/>
-        <w:rPr/>
-      </w:pPr>
-      <w:r>
-        <w:rPr/>
-      </w:r>
-    </w:p>
-    <w:p>
-      <w:pPr>
-        <w:pStyle w:val="Normal"/>
-        <w:bidi w:val="0"/>
-        <w:jc w:val="start"/>
-        <w:rPr/>
-      </w:pPr>
-      <w:r>
-        <w:rPr/>
-      </w:r>
-    </w:p>
-    <w:p>
-      <w:pPr>
-        <w:pStyle w:val="Normal"/>
-        <w:bidi w:val="0"/>
-        <w:jc w:val="start"/>
-        <w:rPr/>
-      </w:pPr>
-      <w:r>
-        <w:rPr/>
-      </w:r>
-    </w:p>
-    <w:p>
-      <w:pPr>
-        <w:pStyle w:val="Normal"/>
-        <w:bidi w:val="0"/>
-        <w:jc w:val="start"/>
         <w:rPr>
           <w:b/>
           <w:bCs/>
         </w:rPr>
       </w:pPr>
       <w:r>
+        <w:rPr/>
+      </w:r>
+      <w:r>
+        <w:br w:type="page"/>
+      </w:r>
+    </w:p>
+    <w:p>
+      <w:pPr>
+        <w:pStyle w:val="Normal"/>
+        <w:bidi w:val="0"/>
+        <w:jc w:val="start"/>
         <w:rPr>
           <w:b/>
           <w:bCs/>
         </w:rPr>
-        <w:t xml:space="preserve">3. Map </w:t>
-      </w:r>
+      </w:pPr>
       <w:r>
         <w:rPr>
           <w:b/>
           <w:bCs/>
         </w:rPr>
-        <w:t>View - Geometries/Polygons</w:t>
+        <w:t>3. Map View - Geometries/Polygons</w:t>
       </w:r>
     </w:p>
     <w:p>
@@ -5351,83 +3832,15 @@
         <w:bidi w:val="0"/>
         <w:jc w:val="start"/>
         <w:rPr>
-          <w:b w:val="false"/>
-          <w:bCs w:val="false"/>
-        </w:rPr>
-      </w:pPr>
-      <w:r>
-        <w:rPr>
-          <w:b w:val="false"/>
-          <w:bCs w:val="false"/>
-        </w:rPr>
-      </w:r>
-    </w:p>
-    <w:p>
-      <w:pPr>
-        <w:pStyle w:val="Normal"/>
-        <w:bidi w:val="0"/>
-        <w:jc w:val="start"/>
-        <w:rPr>
-          <w:b w:val="false"/>
-          <w:bCs w:val="false"/>
-        </w:rPr>
-      </w:pPr>
-      <w:r>
-        <w:rPr>
-          <w:b w:val="false"/>
-          <w:bCs w:val="false"/>
-        </w:rPr>
-      </w:r>
-    </w:p>
-    <w:p>
-      <w:pPr>
-        <w:pStyle w:val="Normal"/>
-        <w:bidi w:val="0"/>
-        <w:jc w:val="start"/>
-        <w:rPr>
-          <w:b w:val="false"/>
-          <w:bCs w:val="false"/>
-        </w:rPr>
-      </w:pPr>
-      <w:r>
-        <w:rPr>
-          <w:b w:val="false"/>
-          <w:bCs w:val="false"/>
-        </w:rPr>
-      </w:r>
-    </w:p>
-    <w:p>
-      <w:pPr>
-        <w:pStyle w:val="Normal"/>
-        <w:bidi w:val="0"/>
-        <w:jc w:val="start"/>
-        <w:rPr>
-          <w:b w:val="false"/>
-          <w:bCs w:val="false"/>
-        </w:rPr>
-      </w:pPr>
-      <w:r>
-        <w:rPr>
-          <w:b w:val="false"/>
-          <w:bCs w:val="false"/>
-        </w:rPr>
-      </w:r>
-    </w:p>
-    <w:p>
-      <w:pPr>
-        <w:pStyle w:val="Normal"/>
-        <w:bidi w:val="0"/>
-        <w:jc w:val="start"/>
-        <w:rPr>
-          <w:b w:val="false"/>
-          <w:bCs w:val="false"/>
-        </w:rPr>
-      </w:pPr>
-      <w:r>
-        <w:rPr>
-          <w:b w:val="false"/>
-          <w:bCs w:val="false"/>
-        </w:rPr>
+          <w:b/>
+          <w:bCs/>
+        </w:rPr>
+      </w:pPr>
+      <w:r>
+        <w:rPr/>
+      </w:r>
+      <w:r>
+        <w:br w:type="page"/>
       </w:r>
     </w:p>
     <w:p>
@@ -5991,367 +4404,10 @@
         </w:rPr>
       </w:pPr>
       <w:r>
-        <w:rPr>
-          <w:b w:val="false"/>
-          <w:bCs w:val="false"/>
-        </w:rPr>
-      </w:r>
-    </w:p>
-    <w:p>
-      <w:pPr>
-        <w:pStyle w:val="Normal"/>
-        <w:bidi w:val="0"/>
-        <w:jc w:val="start"/>
-        <w:rPr>
-          <w:b w:val="false"/>
-          <w:bCs w:val="false"/>
-        </w:rPr>
-      </w:pPr>
-      <w:r>
-        <w:rPr>
-          <w:b w:val="false"/>
-          <w:bCs w:val="false"/>
-        </w:rPr>
-      </w:r>
-    </w:p>
-    <w:p>
-      <w:pPr>
-        <w:pStyle w:val="Normal"/>
-        <w:bidi w:val="0"/>
-        <w:jc w:val="start"/>
-        <w:rPr>
-          <w:b w:val="false"/>
-          <w:bCs w:val="false"/>
-        </w:rPr>
-      </w:pPr>
-      <w:r>
-        <w:rPr>
-          <w:b w:val="false"/>
-          <w:bCs w:val="false"/>
-        </w:rPr>
-      </w:r>
-    </w:p>
-    <w:p>
-      <w:pPr>
-        <w:pStyle w:val="Normal"/>
-        <w:bidi w:val="0"/>
-        <w:jc w:val="start"/>
-        <w:rPr>
-          <w:b w:val="false"/>
-          <w:bCs w:val="false"/>
-        </w:rPr>
-      </w:pPr>
-      <w:r>
-        <w:rPr>
-          <w:b w:val="false"/>
-          <w:bCs w:val="false"/>
-        </w:rPr>
-      </w:r>
-    </w:p>
-    <w:p>
-      <w:pPr>
-        <w:pStyle w:val="Normal"/>
-        <w:bidi w:val="0"/>
-        <w:jc w:val="start"/>
-        <w:rPr>
-          <w:b w:val="false"/>
-          <w:bCs w:val="false"/>
-        </w:rPr>
-      </w:pPr>
-      <w:r>
-        <w:rPr>
-          <w:b w:val="false"/>
-          <w:bCs w:val="false"/>
-        </w:rPr>
-      </w:r>
-    </w:p>
-    <w:p>
-      <w:pPr>
-        <w:pStyle w:val="Normal"/>
-        <w:bidi w:val="0"/>
-        <w:jc w:val="start"/>
-        <w:rPr>
-          <w:b w:val="false"/>
-          <w:bCs w:val="false"/>
-        </w:rPr>
-      </w:pPr>
-      <w:r>
-        <w:rPr>
-          <w:b w:val="false"/>
-          <w:bCs w:val="false"/>
-        </w:rPr>
-      </w:r>
-    </w:p>
-    <w:p>
-      <w:pPr>
-        <w:pStyle w:val="Normal"/>
-        <w:bidi w:val="0"/>
-        <w:jc w:val="start"/>
-        <w:rPr>
-          <w:b w:val="false"/>
-          <w:bCs w:val="false"/>
-        </w:rPr>
-      </w:pPr>
-      <w:r>
-        <w:rPr>
-          <w:b w:val="false"/>
-          <w:bCs w:val="false"/>
-        </w:rPr>
-      </w:r>
-    </w:p>
-    <w:p>
-      <w:pPr>
-        <w:pStyle w:val="Normal"/>
-        <w:bidi w:val="0"/>
-        <w:jc w:val="start"/>
-        <w:rPr>
-          <w:b w:val="false"/>
-          <w:bCs w:val="false"/>
-        </w:rPr>
-      </w:pPr>
-      <w:r>
-        <w:rPr>
-          <w:b w:val="false"/>
-          <w:bCs w:val="false"/>
-        </w:rPr>
-      </w:r>
-    </w:p>
-    <w:p>
-      <w:pPr>
-        <w:pStyle w:val="Normal"/>
-        <w:bidi w:val="0"/>
-        <w:jc w:val="start"/>
-        <w:rPr>
-          <w:b w:val="false"/>
-          <w:bCs w:val="false"/>
-        </w:rPr>
-      </w:pPr>
-      <w:r>
-        <w:rPr>
-          <w:b w:val="false"/>
-          <w:bCs w:val="false"/>
-        </w:rPr>
-      </w:r>
-    </w:p>
-    <w:p>
-      <w:pPr>
-        <w:pStyle w:val="Normal"/>
-        <w:bidi w:val="0"/>
-        <w:jc w:val="start"/>
-        <w:rPr>
-          <w:b w:val="false"/>
-          <w:bCs w:val="false"/>
-        </w:rPr>
-      </w:pPr>
-      <w:r>
-        <w:rPr>
-          <w:b w:val="false"/>
-          <w:bCs w:val="false"/>
-        </w:rPr>
-      </w:r>
-    </w:p>
-    <w:p>
-      <w:pPr>
-        <w:pStyle w:val="Normal"/>
-        <w:bidi w:val="0"/>
-        <w:jc w:val="start"/>
-        <w:rPr>
-          <w:b w:val="false"/>
-          <w:bCs w:val="false"/>
-        </w:rPr>
-      </w:pPr>
-      <w:r>
-        <w:rPr>
-          <w:b w:val="false"/>
-          <w:bCs w:val="false"/>
-        </w:rPr>
-      </w:r>
-    </w:p>
-    <w:p>
-      <w:pPr>
-        <w:pStyle w:val="Normal"/>
-        <w:bidi w:val="0"/>
-        <w:jc w:val="start"/>
-        <w:rPr>
-          <w:b w:val="false"/>
-          <w:bCs w:val="false"/>
-        </w:rPr>
-      </w:pPr>
-      <w:r>
-        <w:rPr>
-          <w:b w:val="false"/>
-          <w:bCs w:val="false"/>
-        </w:rPr>
-      </w:r>
-    </w:p>
-    <w:p>
-      <w:pPr>
-        <w:pStyle w:val="Normal"/>
-        <w:bidi w:val="0"/>
-        <w:jc w:val="start"/>
-        <w:rPr>
-          <w:b w:val="false"/>
-          <w:bCs w:val="false"/>
-        </w:rPr>
-      </w:pPr>
-      <w:r>
-        <w:rPr>
-          <w:b w:val="false"/>
-          <w:bCs w:val="false"/>
-        </w:rPr>
-      </w:r>
-    </w:p>
-    <w:p>
-      <w:pPr>
-        <w:pStyle w:val="Normal"/>
-        <w:bidi w:val="0"/>
-        <w:jc w:val="start"/>
-        <w:rPr>
-          <w:b w:val="false"/>
-          <w:bCs w:val="false"/>
-        </w:rPr>
-      </w:pPr>
-      <w:r>
-        <w:rPr>
-          <w:b w:val="false"/>
-          <w:bCs w:val="false"/>
-        </w:rPr>
-      </w:r>
-    </w:p>
-    <w:p>
-      <w:pPr>
-        <w:pStyle w:val="Normal"/>
-        <w:bidi w:val="0"/>
-        <w:jc w:val="start"/>
-        <w:rPr>
-          <w:b w:val="false"/>
-          <w:bCs w:val="false"/>
-        </w:rPr>
-      </w:pPr>
-      <w:r>
-        <w:rPr>
-          <w:b w:val="false"/>
-          <w:bCs w:val="false"/>
-        </w:rPr>
-      </w:r>
-    </w:p>
-    <w:p>
-      <w:pPr>
-        <w:pStyle w:val="Normal"/>
-        <w:bidi w:val="0"/>
-        <w:jc w:val="start"/>
-        <w:rPr>
-          <w:b w:val="false"/>
-          <w:bCs w:val="false"/>
-        </w:rPr>
-      </w:pPr>
-      <w:r>
-        <w:rPr>
-          <w:b w:val="false"/>
-          <w:bCs w:val="false"/>
-        </w:rPr>
-      </w:r>
-    </w:p>
-    <w:p>
-      <w:pPr>
-        <w:pStyle w:val="Normal"/>
-        <w:bidi w:val="0"/>
-        <w:jc w:val="start"/>
-        <w:rPr>
-          <w:b w:val="false"/>
-          <w:bCs w:val="false"/>
-        </w:rPr>
-      </w:pPr>
-      <w:r>
-        <w:rPr>
-          <w:b w:val="false"/>
-          <w:bCs w:val="false"/>
-        </w:rPr>
-      </w:r>
-    </w:p>
-    <w:p>
-      <w:pPr>
-        <w:pStyle w:val="Normal"/>
-        <w:bidi w:val="0"/>
-        <w:jc w:val="start"/>
-        <w:rPr>
-          <w:b w:val="false"/>
-          <w:bCs w:val="false"/>
-        </w:rPr>
-      </w:pPr>
-      <w:r>
-        <w:rPr>
-          <w:b w:val="false"/>
-          <w:bCs w:val="false"/>
-        </w:rPr>
-      </w:r>
-    </w:p>
-    <w:p>
-      <w:pPr>
-        <w:pStyle w:val="Normal"/>
-        <w:bidi w:val="0"/>
-        <w:jc w:val="start"/>
-        <w:rPr>
-          <w:b w:val="false"/>
-          <w:bCs w:val="false"/>
-        </w:rPr>
-      </w:pPr>
-      <w:r>
-        <w:rPr>
-          <w:b w:val="false"/>
-          <w:bCs w:val="false"/>
-        </w:rPr>
-      </w:r>
-    </w:p>
-    <w:p>
-      <w:pPr>
-        <w:pStyle w:val="Normal"/>
-        <w:bidi w:val="0"/>
-        <w:jc w:val="start"/>
-        <w:rPr>
-          <w:b w:val="false"/>
-          <w:bCs w:val="false"/>
-        </w:rPr>
-      </w:pPr>
-      <w:r>
-        <w:rPr>
-          <w:b w:val="false"/>
-          <w:bCs w:val="false"/>
-        </w:rPr>
-      </w:r>
-    </w:p>
-    <w:p>
-      <w:pPr>
-        <w:pStyle w:val="Normal"/>
-        <w:bidi w:val="0"/>
-        <w:jc w:val="start"/>
-        <w:rPr>
-          <w:b w:val="false"/>
-          <w:bCs w:val="false"/>
-        </w:rPr>
-      </w:pPr>
-      <w:r>
-        <w:rPr>
-          <w:b w:val="false"/>
-          <w:bCs w:val="false"/>
-        </w:rPr>
-      </w:r>
-    </w:p>
-    <w:p>
-      <w:pPr>
-        <w:pStyle w:val="Normal"/>
-        <w:bidi w:val="0"/>
-        <w:jc w:val="start"/>
-        <w:rPr>
-          <w:b w:val="false"/>
-          <w:bCs w:val="false"/>
-        </w:rPr>
-      </w:pPr>
-      <w:r>
-        <w:rPr>
-          <w:b w:val="false"/>
-          <w:bCs w:val="false"/>
-        </w:rPr>
+        <w:rPr/>
+      </w:r>
+      <w:r>
+        <w:br w:type="page"/>
       </w:r>
     </w:p>
     <w:p>
@@ -6664,10 +4720,10 @@
           <wp:anchor behindDoc="0" distT="0" distB="0" distL="0" distR="0" simplePos="0" locked="0" layoutInCell="0" allowOverlap="1" relativeHeight="23">
             <wp:simplePos x="0" y="0"/>
             <wp:positionH relativeFrom="column">
-              <wp:posOffset>760730</wp:posOffset>
+              <wp:posOffset>655955</wp:posOffset>
             </wp:positionH>
             <wp:positionV relativeFrom="paragraph">
-              <wp:posOffset>71755</wp:posOffset>
+              <wp:posOffset>69850</wp:posOffset>
             </wp:positionV>
             <wp:extent cx="4598670" cy="3621405"/>
             <wp:effectExtent l="0" t="0" r="0" b="0"/>
@@ -7070,304 +5126,15 @@
         <w:bidi w:val="0"/>
         <w:jc w:val="start"/>
         <w:rPr>
-          <w:b w:val="false"/>
-          <w:bCs w:val="false"/>
-        </w:rPr>
-      </w:pPr>
-      <w:r>
-        <w:rPr>
-          <w:b w:val="false"/>
-          <w:bCs w:val="false"/>
-        </w:rPr>
-      </w:r>
-    </w:p>
-    <w:p>
-      <w:pPr>
-        <w:pStyle w:val="Normal"/>
-        <w:bidi w:val="0"/>
-        <w:jc w:val="start"/>
-        <w:rPr>
-          <w:b w:val="false"/>
-          <w:bCs w:val="false"/>
-        </w:rPr>
-      </w:pPr>
-      <w:r>
-        <w:rPr>
-          <w:b w:val="false"/>
-          <w:bCs w:val="false"/>
-        </w:rPr>
-      </w:r>
-    </w:p>
-    <w:p>
-      <w:pPr>
-        <w:pStyle w:val="Normal"/>
-        <w:bidi w:val="0"/>
-        <w:jc w:val="start"/>
-        <w:rPr>
-          <w:b w:val="false"/>
-          <w:bCs w:val="false"/>
-        </w:rPr>
-      </w:pPr>
-      <w:r>
-        <w:rPr>
-          <w:b w:val="false"/>
-          <w:bCs w:val="false"/>
-        </w:rPr>
-      </w:r>
-    </w:p>
-    <w:p>
-      <w:pPr>
-        <w:pStyle w:val="Normal"/>
-        <w:bidi w:val="0"/>
-        <w:jc w:val="start"/>
-        <w:rPr>
-          <w:b w:val="false"/>
-          <w:bCs w:val="false"/>
-        </w:rPr>
-      </w:pPr>
-      <w:r>
-        <w:rPr>
-          <w:b w:val="false"/>
-          <w:bCs w:val="false"/>
-        </w:rPr>
-      </w:r>
-    </w:p>
-    <w:p>
-      <w:pPr>
-        <w:pStyle w:val="Normal"/>
-        <w:bidi w:val="0"/>
-        <w:jc w:val="start"/>
-        <w:rPr>
-          <w:b w:val="false"/>
-          <w:bCs w:val="false"/>
-        </w:rPr>
-      </w:pPr>
-      <w:r>
-        <w:rPr>
-          <w:b w:val="false"/>
-          <w:bCs w:val="false"/>
-        </w:rPr>
-      </w:r>
-    </w:p>
-    <w:p>
-      <w:pPr>
-        <w:pStyle w:val="Normal"/>
-        <w:bidi w:val="0"/>
-        <w:jc w:val="start"/>
-        <w:rPr>
-          <w:b w:val="false"/>
-          <w:bCs w:val="false"/>
-        </w:rPr>
-      </w:pPr>
-      <w:r>
-        <w:rPr>
-          <w:b w:val="false"/>
-          <w:bCs w:val="false"/>
-        </w:rPr>
-      </w:r>
-    </w:p>
-    <w:p>
-      <w:pPr>
-        <w:pStyle w:val="Normal"/>
-        <w:bidi w:val="0"/>
-        <w:jc w:val="start"/>
-        <w:rPr>
-          <w:b w:val="false"/>
-          <w:bCs w:val="false"/>
-        </w:rPr>
-      </w:pPr>
-      <w:r>
-        <w:rPr>
-          <w:b w:val="false"/>
-          <w:bCs w:val="false"/>
-        </w:rPr>
-      </w:r>
-    </w:p>
-    <w:p>
-      <w:pPr>
-        <w:pStyle w:val="Normal"/>
-        <w:bidi w:val="0"/>
-        <w:jc w:val="start"/>
-        <w:rPr>
-          <w:b w:val="false"/>
-          <w:bCs w:val="false"/>
-        </w:rPr>
-      </w:pPr>
-      <w:r>
-        <w:rPr>
-          <w:b w:val="false"/>
-          <w:bCs w:val="false"/>
-        </w:rPr>
-      </w:r>
-    </w:p>
-    <w:p>
-      <w:pPr>
-        <w:pStyle w:val="Normal"/>
-        <w:bidi w:val="0"/>
-        <w:jc w:val="start"/>
-        <w:rPr>
-          <w:b w:val="false"/>
-          <w:bCs w:val="false"/>
-        </w:rPr>
-      </w:pPr>
-      <w:r>
-        <w:rPr>
-          <w:b w:val="false"/>
-          <w:bCs w:val="false"/>
-        </w:rPr>
-      </w:r>
-    </w:p>
-    <w:p>
-      <w:pPr>
-        <w:pStyle w:val="Normal"/>
-        <w:bidi w:val="0"/>
-        <w:jc w:val="start"/>
-        <w:rPr>
-          <w:b w:val="false"/>
-          <w:bCs w:val="false"/>
-        </w:rPr>
-      </w:pPr>
-      <w:r>
-        <w:rPr>
-          <w:b w:val="false"/>
-          <w:bCs w:val="false"/>
-        </w:rPr>
-      </w:r>
-    </w:p>
-    <w:p>
-      <w:pPr>
-        <w:pStyle w:val="Normal"/>
-        <w:bidi w:val="0"/>
-        <w:jc w:val="start"/>
-        <w:rPr>
-          <w:b w:val="false"/>
-          <w:bCs w:val="false"/>
-        </w:rPr>
-      </w:pPr>
-      <w:r>
-        <w:rPr>
-          <w:b w:val="false"/>
-          <w:bCs w:val="false"/>
-        </w:rPr>
-      </w:r>
-    </w:p>
-    <w:p>
-      <w:pPr>
-        <w:pStyle w:val="Normal"/>
-        <w:bidi w:val="0"/>
-        <w:jc w:val="start"/>
-        <w:rPr>
-          <w:b w:val="false"/>
-          <w:bCs w:val="false"/>
-        </w:rPr>
-      </w:pPr>
-      <w:r>
-        <w:rPr>
-          <w:b w:val="false"/>
-          <w:bCs w:val="false"/>
-        </w:rPr>
-      </w:r>
-    </w:p>
-    <w:p>
-      <w:pPr>
-        <w:pStyle w:val="Normal"/>
-        <w:bidi w:val="0"/>
-        <w:jc w:val="start"/>
-        <w:rPr>
-          <w:b w:val="false"/>
-          <w:bCs w:val="false"/>
-        </w:rPr>
-      </w:pPr>
-      <w:r>
-        <w:rPr>
-          <w:b w:val="false"/>
-          <w:bCs w:val="false"/>
-        </w:rPr>
-      </w:r>
-    </w:p>
-    <w:p>
-      <w:pPr>
-        <w:pStyle w:val="Normal"/>
-        <w:bidi w:val="0"/>
-        <w:jc w:val="start"/>
-        <w:rPr>
-          <w:b w:val="false"/>
-          <w:bCs w:val="false"/>
-        </w:rPr>
-      </w:pPr>
-      <w:r>
-        <w:rPr>
-          <w:b w:val="false"/>
-          <w:bCs w:val="false"/>
-        </w:rPr>
-      </w:r>
-    </w:p>
-    <w:p>
-      <w:pPr>
-        <w:pStyle w:val="Normal"/>
-        <w:bidi w:val="0"/>
-        <w:jc w:val="start"/>
-        <w:rPr>
-          <w:b w:val="false"/>
-          <w:bCs w:val="false"/>
-        </w:rPr>
-      </w:pPr>
-      <w:r>
-        <w:rPr>
-          <w:b w:val="false"/>
-          <w:bCs w:val="false"/>
-        </w:rPr>
-      </w:r>
-    </w:p>
-    <w:p>
-      <w:pPr>
-        <w:pStyle w:val="Normal"/>
-        <w:bidi w:val="0"/>
-        <w:jc w:val="start"/>
-        <w:rPr>
-          <w:b w:val="false"/>
-          <w:bCs w:val="false"/>
-        </w:rPr>
-      </w:pPr>
-      <w:r>
-        <w:rPr>
-          <w:b w:val="false"/>
-          <w:bCs w:val="false"/>
-        </w:rPr>
-      </w:r>
-    </w:p>
-    <w:p>
-      <w:pPr>
-        <w:pStyle w:val="Normal"/>
-        <w:bidi w:val="0"/>
-        <w:jc w:val="start"/>
-        <w:rPr>
-          <w:b w:val="false"/>
-          <w:bCs w:val="false"/>
-        </w:rPr>
-      </w:pPr>
-      <w:r>
-        <w:rPr>
-          <w:b w:val="false"/>
-          <w:bCs w:val="false"/>
-        </w:rPr>
-      </w:r>
-    </w:p>
-    <w:p>
-      <w:pPr>
-        <w:pStyle w:val="Normal"/>
-        <w:bidi w:val="0"/>
-        <w:jc w:val="start"/>
-        <w:rPr>
-          <w:b w:val="false"/>
-          <w:bCs w:val="false"/>
-        </w:rPr>
-      </w:pPr>
-      <w:r>
-        <w:rPr>
-          <w:b w:val="false"/>
-          <w:bCs w:val="false"/>
-        </w:rPr>
+          <w:b/>
+          <w:bCs/>
+        </w:rPr>
+      </w:pPr>
+      <w:r>
+        <w:rPr/>
+      </w:r>
+      <w:r>
+        <w:br w:type="page"/>
       </w:r>
     </w:p>
     <w:p>
@@ -8387,117 +6154,15 @@
         <w:bidi w:val="0"/>
         <w:jc w:val="start"/>
         <w:rPr>
-          <w:b w:val="false"/>
-          <w:bCs w:val="false"/>
-        </w:rPr>
-      </w:pPr>
-      <w:r>
-        <w:rPr>
-          <w:b w:val="false"/>
-          <w:bCs w:val="false"/>
-        </w:rPr>
-      </w:r>
-    </w:p>
-    <w:p>
-      <w:pPr>
-        <w:pStyle w:val="Normal"/>
-        <w:bidi w:val="0"/>
-        <w:jc w:val="start"/>
-        <w:rPr>
-          <w:b w:val="false"/>
-          <w:bCs w:val="false"/>
-        </w:rPr>
-      </w:pPr>
-      <w:r>
-        <w:rPr>
-          <w:b w:val="false"/>
-          <w:bCs w:val="false"/>
-        </w:rPr>
-      </w:r>
-    </w:p>
-    <w:p>
-      <w:pPr>
-        <w:pStyle w:val="Normal"/>
-        <w:bidi w:val="0"/>
-        <w:jc w:val="start"/>
-        <w:rPr>
-          <w:b w:val="false"/>
-          <w:bCs w:val="false"/>
-        </w:rPr>
-      </w:pPr>
-      <w:r>
-        <w:rPr>
-          <w:b w:val="false"/>
-          <w:bCs w:val="false"/>
-        </w:rPr>
-      </w:r>
-    </w:p>
-    <w:p>
-      <w:pPr>
-        <w:pStyle w:val="Normal"/>
-        <w:bidi w:val="0"/>
-        <w:jc w:val="start"/>
-        <w:rPr>
-          <w:b w:val="false"/>
-          <w:bCs w:val="false"/>
-        </w:rPr>
-      </w:pPr>
-      <w:r>
-        <w:rPr>
-          <w:b w:val="false"/>
-          <w:bCs w:val="false"/>
-        </w:rPr>
-      </w:r>
-    </w:p>
-    <w:p>
-      <w:pPr>
-        <w:pStyle w:val="Normal"/>
-        <w:bidi w:val="0"/>
-        <w:jc w:val="start"/>
-        <w:rPr>
-          <w:b w:val="false"/>
-          <w:bCs w:val="false"/>
-        </w:rPr>
-      </w:pPr>
-      <w:r>
-        <w:rPr>
-          <w:b w:val="false"/>
-          <w:bCs w:val="false"/>
-        </w:rPr>
-      </w:r>
-    </w:p>
-    <w:p>
-      <w:pPr>
-        <w:pStyle w:val="Normal"/>
-        <w:bidi w:val="0"/>
-        <w:jc w:val="start"/>
-        <w:rPr>
-          <w:b w:val="false"/>
-          <w:bCs w:val="false"/>
-        </w:rPr>
-      </w:pPr>
-      <w:r>
-        <w:rPr>
-          <w:b w:val="false"/>
-          <w:bCs w:val="false"/>
-        </w:rPr>
-      </w:r>
-    </w:p>
-    <w:p>
-      <w:pPr>
-        <w:pStyle w:val="Normal"/>
-        <w:bidi w:val="0"/>
-        <w:jc w:val="start"/>
-        <w:rPr>
-          <w:b w:val="false"/>
-          <w:bCs w:val="false"/>
-        </w:rPr>
-      </w:pPr>
-      <w:r>
-        <w:rPr>
-          <w:b w:val="false"/>
-          <w:bCs w:val="false"/>
-        </w:rPr>
+          <w:b/>
+          <w:bCs/>
+        </w:rPr>
+      </w:pPr>
+      <w:r>
+        <w:rPr/>
+      </w:r>
+      <w:r>
+        <w:br w:type="page"/>
       </w:r>
     </w:p>
     <w:p>

</xml_diff>